<commit_message>
update plots, model and report cover page
</commit_message>
<xml_diff>
--- a/Heart_Disease_MLOps_Report.docx
+++ b/Heart_Disease_MLOps_Report.docx
@@ -5614,6 +5614,230 @@
     </w:tbl>
     <w:p/>
     <w:p>
+      <w:pPr>
+        <w:pStyle w:val="Heading2"/>
+        <w:spacing w:before="160" w:after="80"/>
+      </w:pPr>
+      <w:r>
+        <w:rPr>
+          <w:color w:val="1A1A2E"/>
+        </w:rPr>
+        <w:t>8.3 CI/CD Evidence</w:t>
+      </w:r>
+    </w:p>
+    <w:p>
+      <w:pPr>
+        <w:jc w:val="center"/>
+      </w:pPr>
+      <w:r>
+        <w:drawing>
+          <wp:inline xmlns:a="http://schemas.openxmlformats.org/drawingml/2006/main" xmlns:pic="http://schemas.openxmlformats.org/drawingml/2006/picture">
+            <wp:extent cx="5486400" cy="3526971"/>
+            <wp:docPr id="18" name="Picture 18"/>
+            <wp:cNvGraphicFramePr>
+              <a:graphicFrameLocks noChangeAspect="1"/>
+            </wp:cNvGraphicFramePr>
+            <a:graphic>
+              <a:graphicData uri="http://schemas.openxmlformats.org/drawingml/2006/picture">
+                <pic:pic>
+                  <pic:nvPicPr>
+                    <pic:cNvPr id="0" name="12_github_actions_list.png"/>
+                    <pic:cNvPicPr/>
+                  </pic:nvPicPr>
+                  <pic:blipFill>
+                    <a:blip r:embed="rId26"/>
+                    <a:stretch>
+                      <a:fillRect/>
+                    </a:stretch>
+                  </pic:blipFill>
+                  <pic:spPr>
+                    <a:xfrm>
+                      <a:off x="0" y="0"/>
+                      <a:ext cx="5486400" cy="3526971"/>
+                    </a:xfrm>
+                    <a:prstGeom prst="rect"/>
+                  </pic:spPr>
+                </pic:pic>
+              </a:graphicData>
+            </a:graphic>
+          </wp:inline>
+        </w:drawing>
+      </w:r>
+    </w:p>
+    <w:p>
+      <w:pPr>
+        <w:spacing w:after="200"/>
+        <w:jc w:val="center"/>
+      </w:pPr>
+      <w:r>
+        <w:rPr>
+          <w:i/>
+          <w:color w:val="555555"/>
+          <w:sz w:val="18"/>
+        </w:rPr>
+        <w:t>Screenshot: GitHub Actions — all workflow runs (latest: green)</w:t>
+      </w:r>
+    </w:p>
+    <w:p>
+      <w:pPr>
+        <w:jc w:val="center"/>
+      </w:pPr>
+      <w:r>
+        <w:drawing>
+          <wp:inline xmlns:a="http://schemas.openxmlformats.org/drawingml/2006/main" xmlns:pic="http://schemas.openxmlformats.org/drawingml/2006/picture">
+            <wp:extent cx="5486400" cy="3526971"/>
+            <wp:docPr id="19" name="Picture 19"/>
+            <wp:cNvGraphicFramePr>
+              <a:graphicFrameLocks noChangeAspect="1"/>
+            </wp:cNvGraphicFramePr>
+            <a:graphic>
+              <a:graphicData uri="http://schemas.openxmlformats.org/drawingml/2006/picture">
+                <pic:pic>
+                  <pic:nvPicPr>
+                    <pic:cNvPr id="0" name="13_github_actions_run_detail.png"/>
+                    <pic:cNvPicPr/>
+                  </pic:nvPicPr>
+                  <pic:blipFill>
+                    <a:blip r:embed="rId27"/>
+                    <a:stretch>
+                      <a:fillRect/>
+                    </a:stretch>
+                  </pic:blipFill>
+                  <pic:spPr>
+                    <a:xfrm>
+                      <a:off x="0" y="0"/>
+                      <a:ext cx="5486400" cy="3526971"/>
+                    </a:xfrm>
+                    <a:prstGeom prst="rect"/>
+                  </pic:spPr>
+                </pic:pic>
+              </a:graphicData>
+            </a:graphic>
+          </wp:inline>
+        </w:drawing>
+      </w:r>
+    </w:p>
+    <w:p>
+      <w:pPr>
+        <w:spacing w:after="200"/>
+        <w:jc w:val="center"/>
+      </w:pPr>
+      <w:r>
+        <w:rPr>
+          <w:i/>
+          <w:color w:val="555555"/>
+          <w:sz w:val="18"/>
+        </w:rPr>
+        <w:t>Screenshot: GitHub Actions — run detail showing all steps passed</w:t>
+      </w:r>
+    </w:p>
+    <w:p>
+      <w:pPr>
+        <w:jc w:val="center"/>
+      </w:pPr>
+      <w:r>
+        <w:drawing>
+          <wp:inline xmlns:a="http://schemas.openxmlformats.org/drawingml/2006/main" xmlns:pic="http://schemas.openxmlformats.org/drawingml/2006/picture">
+            <wp:extent cx="5486400" cy="3200400"/>
+            <wp:docPr id="20" name="Picture 20"/>
+            <wp:cNvGraphicFramePr>
+              <a:graphicFrameLocks noChangeAspect="1"/>
+            </wp:cNvGraphicFramePr>
+            <a:graphic>
+              <a:graphicData uri="http://schemas.openxmlformats.org/drawingml/2006/picture">
+                <pic:pic>
+                  <pic:nvPicPr>
+                    <pic:cNvPr id="0" name="14_github_actions_job_steps.png"/>
+                    <pic:cNvPicPr/>
+                  </pic:nvPicPr>
+                  <pic:blipFill>
+                    <a:blip r:embed="rId28"/>
+                    <a:stretch>
+                      <a:fillRect/>
+                    </a:stretch>
+                  </pic:blipFill>
+                  <pic:spPr>
+                    <a:xfrm>
+                      <a:off x="0" y="0"/>
+                      <a:ext cx="5486400" cy="3200400"/>
+                    </a:xfrm>
+                    <a:prstGeom prst="rect"/>
+                  </pic:spPr>
+                </pic:pic>
+              </a:graphicData>
+            </a:graphic>
+          </wp:inline>
+        </w:drawing>
+      </w:r>
+    </w:p>
+    <w:p>
+      <w:pPr>
+        <w:spacing w:after="200"/>
+        <w:jc w:val="center"/>
+      </w:pPr>
+      <w:r>
+        <w:rPr>
+          <w:i/>
+          <w:color w:val="555555"/>
+          <w:sz w:val="18"/>
+        </w:rPr>
+        <w:t>Screenshot: GitHub Actions — individual step results</w:t>
+      </w:r>
+    </w:p>
+    <w:p>
+      <w:pPr>
+        <w:jc w:val="center"/>
+      </w:pPr>
+      <w:r>
+        <w:drawing>
+          <wp:inline xmlns:a="http://schemas.openxmlformats.org/drawingml/2006/main" xmlns:pic="http://schemas.openxmlformats.org/drawingml/2006/picture">
+            <wp:extent cx="5486400" cy="3526971"/>
+            <wp:docPr id="21" name="Picture 21"/>
+            <wp:cNvGraphicFramePr>
+              <a:graphicFrameLocks noChangeAspect="1"/>
+            </wp:cNvGraphicFramePr>
+            <a:graphic>
+              <a:graphicData uri="http://schemas.openxmlformats.org/drawingml/2006/picture">
+                <pic:pic>
+                  <pic:nvPicPr>
+                    <pic:cNvPr id="0" name="15_github_repo_home.png"/>
+                    <pic:cNvPicPr/>
+                  </pic:nvPicPr>
+                  <pic:blipFill>
+                    <a:blip r:embed="rId29"/>
+                    <a:stretch>
+                      <a:fillRect/>
+                    </a:stretch>
+                  </pic:blipFill>
+                  <pic:spPr>
+                    <a:xfrm>
+                      <a:off x="0" y="0"/>
+                      <a:ext cx="5486400" cy="3526971"/>
+                    </a:xfrm>
+                    <a:prstGeom prst="rect"/>
+                  </pic:spPr>
+                </pic:pic>
+              </a:graphicData>
+            </a:graphic>
+          </wp:inline>
+        </w:drawing>
+      </w:r>
+    </w:p>
+    <w:p>
+      <w:pPr>
+        <w:spacing w:after="200"/>
+        <w:jc w:val="center"/>
+      </w:pPr>
+      <w:r>
+        <w:rPr>
+          <w:i/>
+          <w:color w:val="555555"/>
+          <w:sz w:val="18"/>
+        </w:rPr>
+        <w:t>Screenshot: GitHub repository — heart-disease-mlops</w:t>
+      </w:r>
+    </w:p>
+    <w:p>
       <w:r>
         <w:br w:type="page"/>
       </w:r>
@@ -6402,6 +6626,389 @@
       </w:r>
     </w:p>
     <w:p>
+      <w:pPr>
+        <w:pStyle w:val="Heading2"/>
+        <w:spacing w:before="160" w:after="80"/>
+      </w:pPr>
+      <w:r>
+        <w:rPr>
+          <w:color w:val="1A1A2E"/>
+        </w:rPr>
+        <w:t>9.4 API in Action</w:t>
+      </w:r>
+    </w:p>
+    <w:p>
+      <w:pPr>
+        <w:jc w:val="center"/>
+      </w:pPr>
+      <w:r>
+        <w:drawing>
+          <wp:inline xmlns:a="http://schemas.openxmlformats.org/drawingml/2006/main" xmlns:pic="http://schemas.openxmlformats.org/drawingml/2006/picture">
+            <wp:extent cx="5486400" cy="3526971"/>
+            <wp:docPr id="22" name="Picture 22"/>
+            <wp:cNvGraphicFramePr>
+              <a:graphicFrameLocks noChangeAspect="1"/>
+            </wp:cNvGraphicFramePr>
+            <a:graphic>
+              <a:graphicData uri="http://schemas.openxmlformats.org/drawingml/2006/picture">
+                <pic:pic>
+                  <pic:nvPicPr>
+                    <pic:cNvPr id="0" name="01_swagger_ui.png"/>
+                    <pic:cNvPicPr/>
+                  </pic:nvPicPr>
+                  <pic:blipFill>
+                    <a:blip r:embed="rId30"/>
+                    <a:stretch>
+                      <a:fillRect/>
+                    </a:stretch>
+                  </pic:blipFill>
+                  <pic:spPr>
+                    <a:xfrm>
+                      <a:off x="0" y="0"/>
+                      <a:ext cx="5486400" cy="3526971"/>
+                    </a:xfrm>
+                    <a:prstGeom prst="rect"/>
+                  </pic:spPr>
+                </pic:pic>
+              </a:graphicData>
+            </a:graphic>
+          </wp:inline>
+        </w:drawing>
+      </w:r>
+    </w:p>
+    <w:p>
+      <w:pPr>
+        <w:spacing w:after="200"/>
+        <w:jc w:val="center"/>
+      </w:pPr>
+      <w:r>
+        <w:rPr>
+          <w:i/>
+          <w:color w:val="555555"/>
+          <w:sz w:val="18"/>
+        </w:rPr>
+        <w:t>Screenshot: FastAPI Swagger UI — auto-generated interactive documentation</w:t>
+      </w:r>
+    </w:p>
+    <w:p>
+      <w:pPr>
+        <w:jc w:val="center"/>
+      </w:pPr>
+      <w:r>
+        <w:drawing>
+          <wp:inline xmlns:a="http://schemas.openxmlformats.org/drawingml/2006/main" xmlns:pic="http://schemas.openxmlformats.org/drawingml/2006/picture">
+            <wp:extent cx="5486400" cy="3526971"/>
+            <wp:docPr id="23" name="Picture 23"/>
+            <wp:cNvGraphicFramePr>
+              <a:graphicFrameLocks noChangeAspect="1"/>
+            </wp:cNvGraphicFramePr>
+            <a:graphic>
+              <a:graphicData uri="http://schemas.openxmlformats.org/drawingml/2006/picture">
+                <pic:pic>
+                  <pic:nvPicPr>
+                    <pic:cNvPr id="0" name="02_swagger_predict_open.png"/>
+                    <pic:cNvPicPr/>
+                  </pic:nvPicPr>
+                  <pic:blipFill>
+                    <a:blip r:embed="rId31"/>
+                    <a:stretch>
+                      <a:fillRect/>
+                    </a:stretch>
+                  </pic:blipFill>
+                  <pic:spPr>
+                    <a:xfrm>
+                      <a:off x="0" y="0"/>
+                      <a:ext cx="5486400" cy="3526971"/>
+                    </a:xfrm>
+                    <a:prstGeom prst="rect"/>
+                  </pic:spPr>
+                </pic:pic>
+              </a:graphicData>
+            </a:graphic>
+          </wp:inline>
+        </w:drawing>
+      </w:r>
+    </w:p>
+    <w:p>
+      <w:pPr>
+        <w:spacing w:after="200"/>
+        <w:jc w:val="center"/>
+      </w:pPr>
+      <w:r>
+        <w:rPr>
+          <w:i/>
+          <w:color w:val="555555"/>
+          <w:sz w:val="18"/>
+        </w:rPr>
+        <w:t>Screenshot: /predict endpoint expanded in Swagger UI</w:t>
+      </w:r>
+    </w:p>
+    <w:p>
+      <w:pPr>
+        <w:jc w:val="center"/>
+      </w:pPr>
+      <w:r>
+        <w:drawing>
+          <wp:inline xmlns:a="http://schemas.openxmlformats.org/drawingml/2006/main" xmlns:pic="http://schemas.openxmlformats.org/drawingml/2006/picture">
+            <wp:extent cx="5486400" cy="3429000"/>
+            <wp:docPr id="24" name="Picture 24"/>
+            <wp:cNvGraphicFramePr>
+              <a:graphicFrameLocks noChangeAspect="1"/>
+            </wp:cNvGraphicFramePr>
+            <a:graphic>
+              <a:graphicData uri="http://schemas.openxmlformats.org/drawingml/2006/picture">
+                <pic:pic>
+                  <pic:nvPicPr>
+                    <pic:cNvPr id="0" name="20_api_predict_high_risk.png"/>
+                    <pic:cNvPicPr/>
+                  </pic:nvPicPr>
+                  <pic:blipFill>
+                    <a:blip r:embed="rId32"/>
+                    <a:stretch>
+                      <a:fillRect/>
+                    </a:stretch>
+                  </pic:blipFill>
+                  <pic:spPr>
+                    <a:xfrm>
+                      <a:off x="0" y="0"/>
+                      <a:ext cx="5486400" cy="3429000"/>
+                    </a:xfrm>
+                    <a:prstGeom prst="rect"/>
+                  </pic:spPr>
+                </pic:pic>
+              </a:graphicData>
+            </a:graphic>
+          </wp:inline>
+        </w:drawing>
+      </w:r>
+    </w:p>
+    <w:p>
+      <w:pPr>
+        <w:spacing w:after="200"/>
+        <w:jc w:val="center"/>
+      </w:pPr>
+      <w:r>
+        <w:rPr>
+          <w:i/>
+          <w:color w:val="555555"/>
+          <w:sz w:val="18"/>
+        </w:rPr>
+        <w:t>Screenshot: /predict response — high risk patient (probability: 0.9982)</w:t>
+      </w:r>
+    </w:p>
+    <w:p>
+      <w:pPr>
+        <w:jc w:val="center"/>
+      </w:pPr>
+      <w:r>
+        <w:drawing>
+          <wp:inline xmlns:a="http://schemas.openxmlformats.org/drawingml/2006/main" xmlns:pic="http://schemas.openxmlformats.org/drawingml/2006/picture">
+            <wp:extent cx="5486400" cy="3429000"/>
+            <wp:docPr id="25" name="Picture 25"/>
+            <wp:cNvGraphicFramePr>
+              <a:graphicFrameLocks noChangeAspect="1"/>
+            </wp:cNvGraphicFramePr>
+            <a:graphic>
+              <a:graphicData uri="http://schemas.openxmlformats.org/drawingml/2006/picture">
+                <pic:pic>
+                  <pic:nvPicPr>
+                    <pic:cNvPr id="0" name="21_api_predict_low_risk.png"/>
+                    <pic:cNvPicPr/>
+                  </pic:nvPicPr>
+                  <pic:blipFill>
+                    <a:blip r:embed="rId33"/>
+                    <a:stretch>
+                      <a:fillRect/>
+                    </a:stretch>
+                  </pic:blipFill>
+                  <pic:spPr>
+                    <a:xfrm>
+                      <a:off x="0" y="0"/>
+                      <a:ext cx="5486400" cy="3429000"/>
+                    </a:xfrm>
+                    <a:prstGeom prst="rect"/>
+                  </pic:spPr>
+                </pic:pic>
+              </a:graphicData>
+            </a:graphic>
+          </wp:inline>
+        </w:drawing>
+      </w:r>
+    </w:p>
+    <w:p>
+      <w:pPr>
+        <w:spacing w:after="200"/>
+        <w:jc w:val="center"/>
+      </w:pPr>
+      <w:r>
+        <w:rPr>
+          <w:i/>
+          <w:color w:val="555555"/>
+          <w:sz w:val="18"/>
+        </w:rPr>
+        <w:t>Screenshot: /predict response — low risk patient (probability: 0.0353)</w:t>
+      </w:r>
+    </w:p>
+    <w:p>
+      <w:pPr>
+        <w:jc w:val="center"/>
+      </w:pPr>
+      <w:r>
+        <w:drawing>
+          <wp:inline xmlns:a="http://schemas.openxmlformats.org/drawingml/2006/main" xmlns:pic="http://schemas.openxmlformats.org/drawingml/2006/picture">
+            <wp:extent cx="5486400" cy="3429000"/>
+            <wp:docPr id="26" name="Picture 26"/>
+            <wp:cNvGraphicFramePr>
+              <a:graphicFrameLocks noChangeAspect="1"/>
+            </wp:cNvGraphicFramePr>
+            <a:graphic>
+              <a:graphicData uri="http://schemas.openxmlformats.org/drawingml/2006/picture">
+                <pic:pic>
+                  <pic:nvPicPr>
+                    <pic:cNvPr id="0" name="22_api_predict_batch.png"/>
+                    <pic:cNvPicPr/>
+                  </pic:nvPicPr>
+                  <pic:blipFill>
+                    <a:blip r:embed="rId34"/>
+                    <a:stretch>
+                      <a:fillRect/>
+                    </a:stretch>
+                  </pic:blipFill>
+                  <pic:spPr>
+                    <a:xfrm>
+                      <a:off x="0" y="0"/>
+                      <a:ext cx="5486400" cy="3429000"/>
+                    </a:xfrm>
+                    <a:prstGeom prst="rect"/>
+                  </pic:spPr>
+                </pic:pic>
+              </a:graphicData>
+            </a:graphic>
+          </wp:inline>
+        </w:drawing>
+      </w:r>
+    </w:p>
+    <w:p>
+      <w:pPr>
+        <w:spacing w:after="200"/>
+        <w:jc w:val="center"/>
+      </w:pPr>
+      <w:r>
+        <w:rPr>
+          <w:i/>
+          <w:color w:val="555555"/>
+          <w:sz w:val="18"/>
+        </w:rPr>
+        <w:t>Screenshot: /predict-batch response — 3 patients with aggregate summary</w:t>
+      </w:r>
+    </w:p>
+    <w:p>
+      <w:pPr>
+        <w:jc w:val="center"/>
+      </w:pPr>
+      <w:r>
+        <w:drawing>
+          <wp:inline xmlns:a="http://schemas.openxmlformats.org/drawingml/2006/main" xmlns:pic="http://schemas.openxmlformats.org/drawingml/2006/picture">
+            <wp:extent cx="5486400" cy="3526971"/>
+            <wp:docPr id="27" name="Picture 27"/>
+            <wp:cNvGraphicFramePr>
+              <a:graphicFrameLocks noChangeAspect="1"/>
+            </wp:cNvGraphicFramePr>
+            <a:graphic>
+              <a:graphicData uri="http://schemas.openxmlformats.org/drawingml/2006/picture">
+                <pic:pic>
+                  <pic:nvPicPr>
+                    <pic:cNvPr id="0" name="04_api_model_info.png"/>
+                    <pic:cNvPicPr/>
+                  </pic:nvPicPr>
+                  <pic:blipFill>
+                    <a:blip r:embed="rId35"/>
+                    <a:stretch>
+                      <a:fillRect/>
+                    </a:stretch>
+                  </pic:blipFill>
+                  <pic:spPr>
+                    <a:xfrm>
+                      <a:off x="0" y="0"/>
+                      <a:ext cx="5486400" cy="3526971"/>
+                    </a:xfrm>
+                    <a:prstGeom prst="rect"/>
+                  </pic:spPr>
+                </pic:pic>
+              </a:graphicData>
+            </a:graphic>
+          </wp:inline>
+        </w:drawing>
+      </w:r>
+    </w:p>
+    <w:p>
+      <w:pPr>
+        <w:spacing w:after="200"/>
+        <w:jc w:val="center"/>
+      </w:pPr>
+      <w:r>
+        <w:rPr>
+          <w:i/>
+          <w:color w:val="555555"/>
+          <w:sz w:val="18"/>
+        </w:rPr>
+        <w:t>Screenshot: /model-info endpoint — model metadata</w:t>
+      </w:r>
+    </w:p>
+    <w:p>
+      <w:pPr>
+        <w:jc w:val="center"/>
+      </w:pPr>
+      <w:r>
+        <w:drawing>
+          <wp:inline xmlns:a="http://schemas.openxmlformats.org/drawingml/2006/main" xmlns:pic="http://schemas.openxmlformats.org/drawingml/2006/picture">
+            <wp:extent cx="5486400" cy="3526971"/>
+            <wp:docPr id="28" name="Picture 28"/>
+            <wp:cNvGraphicFramePr>
+              <a:graphicFrameLocks noChangeAspect="1"/>
+            </wp:cNvGraphicFramePr>
+            <a:graphic>
+              <a:graphicData uri="http://schemas.openxmlformats.org/drawingml/2006/picture">
+                <pic:pic>
+                  <pic:nvPicPr>
+                    <pic:cNvPr id="0" name="05_api_stats.png"/>
+                    <pic:cNvPicPr/>
+                  </pic:nvPicPr>
+                  <pic:blipFill>
+                    <a:blip r:embed="rId36"/>
+                    <a:stretch>
+                      <a:fillRect/>
+                    </a:stretch>
+                  </pic:blipFill>
+                  <pic:spPr>
+                    <a:xfrm>
+                      <a:off x="0" y="0"/>
+                      <a:ext cx="5486400" cy="3526971"/>
+                    </a:xfrm>
+                    <a:prstGeom prst="rect"/>
+                  </pic:spPr>
+                </pic:pic>
+              </a:graphicData>
+            </a:graphic>
+          </wp:inline>
+        </w:drawing>
+      </w:r>
+    </w:p>
+    <w:p>
+      <w:pPr>
+        <w:spacing w:after="200"/>
+        <w:jc w:val="center"/>
+      </w:pPr>
+      <w:r>
+        <w:rPr>
+          <w:i/>
+          <w:color w:val="555555"/>
+          <w:sz w:val="18"/>
+        </w:rPr>
+        <w:t>Screenshot: /stats endpoint — live prediction counters</w:t>
+      </w:r>
+    </w:p>
+    <w:p>
       <w:r>
         <w:br w:type="page"/>
       </w:r>
@@ -7005,6 +7612,71 @@
           <w:sz w:val="18"/>
         </w:rPr>
         <w:t># {"prediction":1,"probability":0.9982,"risk":"high",...}</w:t>
+      </w:r>
+    </w:p>
+    <w:p>
+      <w:pPr>
+        <w:pStyle w:val="Heading2"/>
+        <w:spacing w:before="160" w:after="80"/>
+      </w:pPr>
+      <w:r>
+        <w:rPr>
+          <w:color w:val="1A1A2E"/>
+        </w:rPr>
+        <w:t>10.4 Deployment Evidence</w:t>
+      </w:r>
+    </w:p>
+    <w:p>
+      <w:pPr>
+        <w:jc w:val="center"/>
+      </w:pPr>
+      <w:r>
+        <w:drawing>
+          <wp:inline xmlns:a="http://schemas.openxmlformats.org/drawingml/2006/main" xmlns:pic="http://schemas.openxmlformats.org/drawingml/2006/picture">
+            <wp:extent cx="5486400" cy="3200400"/>
+            <wp:docPr id="29" name="Picture 29"/>
+            <wp:cNvGraphicFramePr>
+              <a:graphicFrameLocks noChangeAspect="1"/>
+            </wp:cNvGraphicFramePr>
+            <a:graphic>
+              <a:graphicData uri="http://schemas.openxmlformats.org/drawingml/2006/picture">
+                <pic:pic>
+                  <pic:nvPicPr>
+                    <pic:cNvPr id="0" name="23_kubernetes_deployment.png"/>
+                    <pic:cNvPicPr/>
+                  </pic:nvPicPr>
+                  <pic:blipFill>
+                    <a:blip r:embed="rId37"/>
+                    <a:stretch>
+                      <a:fillRect/>
+                    </a:stretch>
+                  </pic:blipFill>
+                  <pic:spPr>
+                    <a:xfrm>
+                      <a:off x="0" y="0"/>
+                      <a:ext cx="5486400" cy="3200400"/>
+                    </a:xfrm>
+                    <a:prstGeom prst="rect"/>
+                  </pic:spPr>
+                </pic:pic>
+              </a:graphicData>
+            </a:graphic>
+          </wp:inline>
+        </w:drawing>
+      </w:r>
+    </w:p>
+    <w:p>
+      <w:pPr>
+        <w:spacing w:after="200"/>
+        <w:jc w:val="center"/>
+      </w:pPr>
+      <w:r>
+        <w:rPr>
+          <w:i/>
+          <w:color w:val="555555"/>
+          <w:sz w:val="18"/>
+        </w:rPr>
+        <w:t>Screenshot: kubectl output — 2 pods Running, LoadBalancer service exposed, API responding</w:t>
       </w:r>
     </w:p>
     <w:p>
@@ -7573,6 +8245,401 @@
           <w:sz w:val="22"/>
         </w:rPr>
         <w:t>Prometheus scrapes /metrics every 15 seconds. Grafana connects to Prometheus as a data source and the provided grafana-dashboard.json imports a dashboard with four panels: prediction request rate, total predictions by risk level, latency p50/p95, and API success rate.</w:t>
+      </w:r>
+    </w:p>
+    <w:p>
+      <w:pPr>
+        <w:pStyle w:val="Heading2"/>
+        <w:spacing w:before="160" w:after="80"/>
+      </w:pPr>
+      <w:r>
+        <w:rPr>
+          <w:color w:val="1A1A2E"/>
+        </w:rPr>
+        <w:t>11.4 Monitoring Evidence</w:t>
+      </w:r>
+    </w:p>
+    <w:p>
+      <w:pPr>
+        <w:jc w:val="center"/>
+      </w:pPr>
+      <w:r>
+        <w:drawing>
+          <wp:inline xmlns:a="http://schemas.openxmlformats.org/drawingml/2006/main" xmlns:pic="http://schemas.openxmlformats.org/drawingml/2006/picture">
+            <wp:extent cx="5486400" cy="3526971"/>
+            <wp:docPr id="30" name="Picture 30"/>
+            <wp:cNvGraphicFramePr>
+              <a:graphicFrameLocks noChangeAspect="1"/>
+            </wp:cNvGraphicFramePr>
+            <a:graphic>
+              <a:graphicData uri="http://schemas.openxmlformats.org/drawingml/2006/picture">
+                <pic:pic>
+                  <pic:nvPicPr>
+                    <pic:cNvPr id="0" name="16_prometheus_targets.png"/>
+                    <pic:cNvPicPr/>
+                  </pic:nvPicPr>
+                  <pic:blipFill>
+                    <a:blip r:embed="rId38"/>
+                    <a:stretch>
+                      <a:fillRect/>
+                    </a:stretch>
+                  </pic:blipFill>
+                  <pic:spPr>
+                    <a:xfrm>
+                      <a:off x="0" y="0"/>
+                      <a:ext cx="5486400" cy="3526971"/>
+                    </a:xfrm>
+                    <a:prstGeom prst="rect"/>
+                  </pic:spPr>
+                </pic:pic>
+              </a:graphicData>
+            </a:graphic>
+          </wp:inline>
+        </w:drawing>
+      </w:r>
+    </w:p>
+    <w:p>
+      <w:pPr>
+        <w:spacing w:after="200"/>
+        <w:jc w:val="center"/>
+      </w:pPr>
+      <w:r>
+        <w:rPr>
+          <w:i/>
+          <w:color w:val="555555"/>
+          <w:sz w:val="18"/>
+        </w:rPr>
+        <w:t>Screenshot: Prometheus targets page — heart-risk-api showing status UP</w:t>
+      </w:r>
+    </w:p>
+    <w:p>
+      <w:pPr>
+        <w:jc w:val="center"/>
+      </w:pPr>
+      <w:r>
+        <w:drawing>
+          <wp:inline xmlns:a="http://schemas.openxmlformats.org/drawingml/2006/main" xmlns:pic="http://schemas.openxmlformats.org/drawingml/2006/picture">
+            <wp:extent cx="5486400" cy="3526971"/>
+            <wp:docPr id="31" name="Picture 31"/>
+            <wp:cNvGraphicFramePr>
+              <a:graphicFrameLocks noChangeAspect="1"/>
+            </wp:cNvGraphicFramePr>
+            <a:graphic>
+              <a:graphicData uri="http://schemas.openxmlformats.org/drawingml/2006/picture">
+                <pic:pic>
+                  <pic:nvPicPr>
+                    <pic:cNvPr id="0" name="17_prometheus_query.png"/>
+                    <pic:cNvPicPr/>
+                  </pic:nvPicPr>
+                  <pic:blipFill>
+                    <a:blip r:embed="rId39"/>
+                    <a:stretch>
+                      <a:fillRect/>
+                    </a:stretch>
+                  </pic:blipFill>
+                  <pic:spPr>
+                    <a:xfrm>
+                      <a:off x="0" y="0"/>
+                      <a:ext cx="5486400" cy="3526971"/>
+                    </a:xfrm>
+                    <a:prstGeom prst="rect"/>
+                  </pic:spPr>
+                </pic:pic>
+              </a:graphicData>
+            </a:graphic>
+          </wp:inline>
+        </w:drawing>
+      </w:r>
+    </w:p>
+    <w:p>
+      <w:pPr>
+        <w:spacing w:after="200"/>
+        <w:jc w:val="center"/>
+      </w:pPr>
+      <w:r>
+        <w:rPr>
+          <w:i/>
+          <w:color w:val="555555"/>
+          <w:sz w:val="18"/>
+        </w:rPr>
+        <w:t>Screenshot: Prometheus query — heart_risk_predictions_total by risk level</w:t>
+      </w:r>
+    </w:p>
+    <w:p>
+      <w:pPr>
+        <w:jc w:val="center"/>
+      </w:pPr>
+      <w:r>
+        <w:drawing>
+          <wp:inline xmlns:a="http://schemas.openxmlformats.org/drawingml/2006/main" xmlns:pic="http://schemas.openxmlformats.org/drawingml/2006/picture">
+            <wp:extent cx="5486400" cy="3526971"/>
+            <wp:docPr id="32" name="Picture 32"/>
+            <wp:cNvGraphicFramePr>
+              <a:graphicFrameLocks noChangeAspect="1"/>
+            </wp:cNvGraphicFramePr>
+            <a:graphic>
+              <a:graphicData uri="http://schemas.openxmlformats.org/drawingml/2006/picture">
+                <pic:pic>
+                  <pic:nvPicPr>
+                    <pic:cNvPr id="0" name="18_grafana_dashboard.png"/>
+                    <pic:cNvPicPr/>
+                  </pic:nvPicPr>
+                  <pic:blipFill>
+                    <a:blip r:embed="rId40"/>
+                    <a:stretch>
+                      <a:fillRect/>
+                    </a:stretch>
+                  </pic:blipFill>
+                  <pic:spPr>
+                    <a:xfrm>
+                      <a:off x="0" y="0"/>
+                      <a:ext cx="5486400" cy="3526971"/>
+                    </a:xfrm>
+                    <a:prstGeom prst="rect"/>
+                  </pic:spPr>
+                </pic:pic>
+              </a:graphicData>
+            </a:graphic>
+          </wp:inline>
+        </w:drawing>
+      </w:r>
+    </w:p>
+    <w:p>
+      <w:pPr>
+        <w:spacing w:after="200"/>
+        <w:jc w:val="center"/>
+      </w:pPr>
+      <w:r>
+        <w:rPr>
+          <w:i/>
+          <w:color w:val="555555"/>
+          <w:sz w:val="18"/>
+        </w:rPr>
+        <w:t>Screenshot: Grafana dashboard — 4 panels showing request rate, predictions, latency</w:t>
+      </w:r>
+    </w:p>
+    <w:p>
+      <w:pPr>
+        <w:jc w:val="center"/>
+      </w:pPr>
+      <w:r>
+        <w:drawing>
+          <wp:inline xmlns:a="http://schemas.openxmlformats.org/drawingml/2006/main" xmlns:pic="http://schemas.openxmlformats.org/drawingml/2006/picture">
+            <wp:extent cx="5486400" cy="3429000"/>
+            <wp:docPr id="33" name="Picture 33"/>
+            <wp:cNvGraphicFramePr>
+              <a:graphicFrameLocks noChangeAspect="1"/>
+            </wp:cNvGraphicFramePr>
+            <a:graphic>
+              <a:graphicData uri="http://schemas.openxmlformats.org/drawingml/2006/picture">
+                <pic:pic>
+                  <pic:nvPicPr>
+                    <pic:cNvPr id="0" name="19_grafana_dashboard_wide.png"/>
+                    <pic:cNvPicPr/>
+                  </pic:nvPicPr>
+                  <pic:blipFill>
+                    <a:blip r:embed="rId41"/>
+                    <a:stretch>
+                      <a:fillRect/>
+                    </a:stretch>
+                  </pic:blipFill>
+                  <pic:spPr>
+                    <a:xfrm>
+                      <a:off x="0" y="0"/>
+                      <a:ext cx="5486400" cy="3429000"/>
+                    </a:xfrm>
+                    <a:prstGeom prst="rect"/>
+                  </pic:spPr>
+                </pic:pic>
+              </a:graphicData>
+            </a:graphic>
+          </wp:inline>
+        </w:drawing>
+      </w:r>
+    </w:p>
+    <w:p>
+      <w:pPr>
+        <w:spacing w:after="200"/>
+        <w:jc w:val="center"/>
+      </w:pPr>
+      <w:r>
+        <w:rPr>
+          <w:i/>
+          <w:color w:val="555555"/>
+          <w:sz w:val="18"/>
+        </w:rPr>
+        <w:t>Screenshot: Grafana dashboard (wide view) — Heart Disease Risk API monitoring</w:t>
+      </w:r>
+    </w:p>
+    <w:p>
+      <w:pPr>
+        <w:jc w:val="center"/>
+      </w:pPr>
+      <w:r>
+        <w:drawing>
+          <wp:inline xmlns:a="http://schemas.openxmlformats.org/drawingml/2006/main" xmlns:pic="http://schemas.openxmlformats.org/drawingml/2006/picture">
+            <wp:extent cx="5486400" cy="3526971"/>
+            <wp:docPr id="34" name="Picture 34"/>
+            <wp:cNvGraphicFramePr>
+              <a:graphicFrameLocks noChangeAspect="1"/>
+            </wp:cNvGraphicFramePr>
+            <a:graphic>
+              <a:graphicData uri="http://schemas.openxmlformats.org/drawingml/2006/picture">
+                <pic:pic>
+                  <pic:nvPicPr>
+                    <pic:cNvPr id="0" name="06_api_metrics.png"/>
+                    <pic:cNvPicPr/>
+                  </pic:nvPicPr>
+                  <pic:blipFill>
+                    <a:blip r:embed="rId42"/>
+                    <a:stretch>
+                      <a:fillRect/>
+                    </a:stretch>
+                  </pic:blipFill>
+                  <pic:spPr>
+                    <a:xfrm>
+                      <a:off x="0" y="0"/>
+                      <a:ext cx="5486400" cy="3526971"/>
+                    </a:xfrm>
+                    <a:prstGeom prst="rect"/>
+                  </pic:spPr>
+                </pic:pic>
+              </a:graphicData>
+            </a:graphic>
+          </wp:inline>
+        </w:drawing>
+      </w:r>
+    </w:p>
+    <w:p>
+      <w:pPr>
+        <w:spacing w:after="200"/>
+        <w:jc w:val="center"/>
+      </w:pPr>
+      <w:r>
+        <w:rPr>
+          <w:i/>
+          <w:color w:val="555555"/>
+          <w:sz w:val="18"/>
+        </w:rPr>
+        <w:t>Screenshot: /metrics endpoint — Prometheus metrics exposed by the API</w:t>
+      </w:r>
+    </w:p>
+    <w:p>
+      <w:pPr>
+        <w:pStyle w:val="Heading2"/>
+        <w:spacing w:before="160" w:after="80"/>
+      </w:pPr>
+      <w:r>
+        <w:rPr>
+          <w:color w:val="1A1A2E"/>
+        </w:rPr>
+        <w:t>11.5 MLflow Experiment Tracking Evidence</w:t>
+      </w:r>
+    </w:p>
+    <w:p>
+      <w:pPr>
+        <w:jc w:val="center"/>
+      </w:pPr>
+      <w:r>
+        <w:drawing>
+          <wp:inline xmlns:a="http://schemas.openxmlformats.org/drawingml/2006/main" xmlns:pic="http://schemas.openxmlformats.org/drawingml/2006/picture">
+            <wp:extent cx="5486400" cy="3526971"/>
+            <wp:docPr id="35" name="Picture 35"/>
+            <wp:cNvGraphicFramePr>
+              <a:graphicFrameLocks noChangeAspect="1"/>
+            </wp:cNvGraphicFramePr>
+            <a:graphic>
+              <a:graphicData uri="http://schemas.openxmlformats.org/drawingml/2006/picture">
+                <pic:pic>
+                  <pic:nvPicPr>
+                    <pic:cNvPr id="0" name="07_mlflow_home.png"/>
+                    <pic:cNvPicPr/>
+                  </pic:nvPicPr>
+                  <pic:blipFill>
+                    <a:blip r:embed="rId43"/>
+                    <a:stretch>
+                      <a:fillRect/>
+                    </a:stretch>
+                  </pic:blipFill>
+                  <pic:spPr>
+                    <a:xfrm>
+                      <a:off x="0" y="0"/>
+                      <a:ext cx="5486400" cy="3526971"/>
+                    </a:xfrm>
+                    <a:prstGeom prst="rect"/>
+                  </pic:spPr>
+                </pic:pic>
+              </a:graphicData>
+            </a:graphic>
+          </wp:inline>
+        </w:drawing>
+      </w:r>
+    </w:p>
+    <w:p>
+      <w:pPr>
+        <w:spacing w:after="200"/>
+        <w:jc w:val="center"/>
+      </w:pPr>
+      <w:r>
+        <w:rPr>
+          <w:i/>
+          <w:color w:val="555555"/>
+          <w:sz w:val="18"/>
+        </w:rPr>
+        <w:t>Screenshot: MLflow UI home — heart-disease-classification experiment</w:t>
+      </w:r>
+    </w:p>
+    <w:p>
+      <w:pPr>
+        <w:jc w:val="center"/>
+      </w:pPr>
+      <w:r>
+        <w:drawing>
+          <wp:inline xmlns:a="http://schemas.openxmlformats.org/drawingml/2006/main" xmlns:pic="http://schemas.openxmlformats.org/drawingml/2006/picture">
+            <wp:extent cx="5486400" cy="3526971"/>
+            <wp:docPr id="36" name="Picture 36"/>
+            <wp:cNvGraphicFramePr>
+              <a:graphicFrameLocks noChangeAspect="1"/>
+            </wp:cNvGraphicFramePr>
+            <a:graphic>
+              <a:graphicData uri="http://schemas.openxmlformats.org/drawingml/2006/picture">
+                <pic:pic>
+                  <pic:nvPicPr>
+                    <pic:cNvPr id="0" name="08_mlflow_runs_list.png"/>
+                    <pic:cNvPicPr/>
+                  </pic:nvPicPr>
+                  <pic:blipFill>
+                    <a:blip r:embed="rId44"/>
+                    <a:stretch>
+                      <a:fillRect/>
+                    </a:stretch>
+                  </pic:blipFill>
+                  <pic:spPr>
+                    <a:xfrm>
+                      <a:off x="0" y="0"/>
+                      <a:ext cx="5486400" cy="3526971"/>
+                    </a:xfrm>
+                    <a:prstGeom prst="rect"/>
+                  </pic:spPr>
+                </pic:pic>
+              </a:graphicData>
+            </a:graphic>
+          </wp:inline>
+        </w:drawing>
+      </w:r>
+    </w:p>
+    <w:p>
+      <w:pPr>
+        <w:spacing w:after="200"/>
+        <w:jc w:val="center"/>
+      </w:pPr>
+      <w:r>
+        <w:rPr>
+          <w:i/>
+          <w:color w:val="555555"/>
+          <w:sz w:val="18"/>
+        </w:rPr>
+        <w:t>Screenshot: MLflow runs — 3 models with ROC-AUC metrics visible</w:t>
       </w:r>
     </w:p>
     <w:p>

</xml_diff>

<commit_message>
update tools diagram icons
</commit_message>
<xml_diff>
--- a/Heart_Disease_MLOps_Report.docx
+++ b/Heart_Disease_MLOps_Report.docx
@@ -2,142 +2,414 @@
 <file path=word/document.xml><?xml version="1.0" encoding="utf-8"?>
 <w:document xmlns:wpc="http://schemas.microsoft.com/office/word/2010/wordprocessingCanvas" xmlns:mo="http://schemas.microsoft.com/office/mac/office/2008/main" xmlns:mc="http://schemas.openxmlformats.org/markup-compatibility/2006" xmlns:mv="urn:schemas-microsoft-com:mac:vml" xmlns:o="urn:schemas-microsoft-com:office:office" xmlns:r="http://schemas.openxmlformats.org/officeDocument/2006/relationships" xmlns:m="http://schemas.openxmlformats.org/officeDocument/2006/math" xmlns:v="urn:schemas-microsoft-com:vml" xmlns:wp14="http://schemas.microsoft.com/office/word/2010/wordprocessingDrawing" xmlns:wp="http://schemas.openxmlformats.org/drawingml/2006/wordprocessingDrawing" xmlns:w10="urn:schemas-microsoft-com:office:word" xmlns:w="http://schemas.openxmlformats.org/wordprocessingml/2006/main" xmlns:w14="http://schemas.microsoft.com/office/word/2010/wordml" xmlns:wpg="http://schemas.microsoft.com/office/word/2010/wordprocessingGroup" xmlns:wpi="http://schemas.microsoft.com/office/word/2010/wordprocessingInk" xmlns:wne="http://schemas.microsoft.com/office/word/2006/wordml" xmlns:wps="http://schemas.microsoft.com/office/word/2010/wordprocessingShape" mc:Ignorable="w14 wp14">
   <w:body>
+    <w:tbl>
+      <w:tblPr>
+        <w:tblW w:type="auto" w:w="0"/>
+        <w:jc w:val="center"/>
+        <w:tblLook w:firstColumn="1" w:firstRow="1" w:lastColumn="0" w:lastRow="0" w:noHBand="0" w:noVBand="1" w:val="04A0"/>
+      </w:tblPr>
+      <w:tblGrid>
+        <w:gridCol w:w="9066"/>
+      </w:tblGrid>
+      <w:tr>
+        <w:trPr>
+          <w:trHeight w:val="320" w:hRule="exact"/>
+        </w:trPr>
+        <w:tc>
+          <w:tcPr>
+            <w:tcW w:type="dxa" w:w="9066"/>
+            <w:shd w:val="clear" w:color="auto" w:fill="1A1A2E"/>
+            <w:tcMar>
+              <w:top w:w="0" w:type="dxa"/>
+              <w:bottom w:w="0" w:type="dxa"/>
+              <w:left w:w="0" w:type="dxa"/>
+              <w:right w:w="0" w:type="dxa"/>
+            </w:tcMar>
+          </w:tcPr>
+          <w:p>
+            <w:r/>
+          </w:p>
+        </w:tc>
+      </w:tr>
+    </w:tbl>
+    <w:p/>
+    <w:p/>
     <w:p/>
     <w:p/>
     <w:p>
       <w:pPr>
+        <w:spacing w:after="120"/>
         <w:jc w:val="center"/>
       </w:pPr>
       <w:r>
         <w:rPr>
           <w:b/>
           <w:color w:val="1A1A2E"/>
-          <w:sz w:val="56"/>
+          <w:sz w:val="64"/>
         </w:rPr>
         <w:t>Heart Disease Risk Prediction</w:t>
       </w:r>
     </w:p>
     <w:p>
       <w:pPr>
+        <w:spacing w:after="80"/>
         <w:jc w:val="center"/>
       </w:pPr>
       <w:r>
         <w:rPr>
-          <w:color w:val="555555"/>
-          <w:sz w:val="32"/>
+          <w:color w:val="58A6FF"/>
+          <w:sz w:val="36"/>
         </w:rPr>
-        <w:t>End-to-End MLOps Pipeline — Assignment 01</w:t>
-      </w:r>
-    </w:p>
-    <w:p/>
-    <w:p>
-      <w:pPr>
-        <w:jc w:val="center"/>
-      </w:pPr>
-      <w:r>
-        <w:rPr>
-          <w:b/>
-          <w:sz w:val="22"/>
-        </w:rPr>
-        <w:t xml:space="preserve">Course: </w:t>
-      </w:r>
-      <w:r>
-        <w:rPr>
-          <w:sz w:val="22"/>
-        </w:rPr>
-        <w:t>Machine Learning Operations (MLOps) — AIMLCZG523</w:t>
+        <w:t>End-to-End MLOps Pipeline</w:t>
       </w:r>
     </w:p>
     <w:p>
       <w:pPr>
+        <w:spacing w:after="400"/>
         <w:jc w:val="center"/>
       </w:pPr>
       <w:r>
         <w:rPr>
-          <w:b/>
+          <w:i/>
+          <w:color w:val="888888"/>
           <w:sz w:val="22"/>
         </w:rPr>
-        <w:t xml:space="preserve">Institution: </w:t>
-      </w:r>
-      <w:r>
-        <w:rPr>
-          <w:sz w:val="22"/>
-        </w:rPr>
-        <w:t>BITS Pilani</w:t>
+        <w:t>FastAPI  ·  MLflow  ·  Docker  ·  Kubernetes  ·  Prometheus + Grafana</w:t>
       </w:r>
     </w:p>
     <w:p>
       <w:pPr>
+        <w:pBdr>
+          <w:bottom w:val="single" w:sz="4" w:space="1" w:color="C0C0C0"/>
+        </w:pBdr>
+        <w:spacing w:after="320"/>
+      </w:pPr>
+    </w:p>
+    <w:tbl>
+      <w:tblPr>
+        <w:tblW w:type="auto" w:w="0"/>
         <w:jc w:val="center"/>
-      </w:pPr>
-      <w:r>
-        <w:rPr>
-          <w:b/>
-          <w:sz w:val="22"/>
-        </w:rPr>
-        <w:t xml:space="preserve">Student: </w:t>
-      </w:r>
-      <w:r>
-        <w:rPr>
-          <w:sz w:val="22"/>
-        </w:rPr>
-        <w:t>Swathi</w:t>
-      </w:r>
+        <w:tblLook w:firstColumn="1" w:firstRow="1" w:lastColumn="0" w:lastRow="0" w:noHBand="0" w:noVBand="1" w:val="04A0"/>
+        <w:tblBorders>
+          <w:top w:val="none" w:sz="0" w:space="0" w:color="auto"/>
+          <w:left w:val="none" w:sz="0" w:space="0" w:color="auto"/>
+          <w:bottom w:val="none" w:sz="0" w:space="0" w:color="auto"/>
+          <w:right w:val="none" w:sz="0" w:space="0" w:color="auto"/>
+          <w:insideH w:val="none" w:sz="0" w:space="0" w:color="auto"/>
+          <w:insideV w:val="none" w:sz="0" w:space="0" w:color="auto"/>
+        </w:tblBorders>
+      </w:tblPr>
+      <w:tblGrid>
+        <w:gridCol w:w="4533"/>
+        <w:gridCol w:w="4533"/>
+      </w:tblGrid>
+      <w:tr>
+        <w:tc>
+          <w:tcPr>
+            <w:tcW w:type="dxa" w:w="2592"/>
+          </w:tcPr>
+          <w:p>
+            <w:pPr>
+              <w:spacing w:after="100"/>
+              <w:jc w:val="right"/>
+            </w:pPr>
+            <w:r>
+              <w:rPr>
+                <w:b/>
+                <w:color w:val="1A1A2E"/>
+                <w:sz w:val="22"/>
+              </w:rPr>
+              <w:t>Course</w:t>
+            </w:r>
+          </w:p>
+        </w:tc>
+        <w:tc>
+          <w:tcPr>
+            <w:tcW w:type="dxa" w:w="5760"/>
+          </w:tcPr>
+          <w:p>
+            <w:pPr>
+              <w:spacing w:after="100"/>
+            </w:pPr>
+            <w:r>
+              <w:rPr>
+                <w:color w:val="333333"/>
+                <w:sz w:val="22"/>
+              </w:rPr>
+              <w:t>Machine Learning Operations (MLOps) — AIMLCZG523</w:t>
+            </w:r>
+          </w:p>
+        </w:tc>
+      </w:tr>
+      <w:tr>
+        <w:tc>
+          <w:tcPr>
+            <w:tcW w:type="dxa" w:w="2592"/>
+          </w:tcPr>
+          <w:p>
+            <w:pPr>
+              <w:spacing w:after="100"/>
+              <w:jc w:val="right"/>
+            </w:pPr>
+            <w:r>
+              <w:rPr>
+                <w:b/>
+                <w:color w:val="1A1A2E"/>
+                <w:sz w:val="22"/>
+              </w:rPr>
+              <w:t>Assignment</w:t>
+            </w:r>
+          </w:p>
+        </w:tc>
+        <w:tc>
+          <w:tcPr>
+            <w:tcW w:type="dxa" w:w="5760"/>
+          </w:tcPr>
+          <w:p>
+            <w:pPr>
+              <w:spacing w:after="100"/>
+            </w:pPr>
+            <w:r>
+              <w:rPr>
+                <w:color w:val="333333"/>
+                <w:sz w:val="22"/>
+              </w:rPr>
+              <w:t>Assignment 01</w:t>
+            </w:r>
+          </w:p>
+        </w:tc>
+      </w:tr>
+      <w:tr>
+        <w:tc>
+          <w:tcPr>
+            <w:tcW w:type="dxa" w:w="2592"/>
+          </w:tcPr>
+          <w:p>
+            <w:pPr>
+              <w:spacing w:after="100"/>
+              <w:jc w:val="right"/>
+            </w:pPr>
+            <w:r>
+              <w:rPr>
+                <w:b/>
+                <w:color w:val="1A1A2E"/>
+                <w:sz w:val="22"/>
+              </w:rPr>
+              <w:t>Institution</w:t>
+            </w:r>
+          </w:p>
+        </w:tc>
+        <w:tc>
+          <w:tcPr>
+            <w:tcW w:type="dxa" w:w="5760"/>
+          </w:tcPr>
+          <w:p>
+            <w:pPr>
+              <w:spacing w:after="100"/>
+            </w:pPr>
+            <w:r>
+              <w:rPr>
+                <w:color w:val="333333"/>
+                <w:sz w:val="22"/>
+              </w:rPr>
+              <w:t>BITS Pilani</w:t>
+            </w:r>
+          </w:p>
+        </w:tc>
+      </w:tr>
+      <w:tr>
+        <w:tc>
+          <w:tcPr>
+            <w:tcW w:type="dxa" w:w="2592"/>
+          </w:tcPr>
+          <w:p>
+            <w:pPr>
+              <w:spacing w:after="100"/>
+              <w:jc w:val="right"/>
+            </w:pPr>
+            <w:r>
+              <w:rPr>
+                <w:b/>
+                <w:color w:val="1A1A2E"/>
+                <w:sz w:val="22"/>
+              </w:rPr>
+              <w:t>Student Name</w:t>
+            </w:r>
+          </w:p>
+        </w:tc>
+        <w:tc>
+          <w:tcPr>
+            <w:tcW w:type="dxa" w:w="5760"/>
+          </w:tcPr>
+          <w:p>
+            <w:pPr>
+              <w:spacing w:after="100"/>
+            </w:pPr>
+            <w:r>
+              <w:rPr>
+                <w:color w:val="333333"/>
+                <w:sz w:val="22"/>
+              </w:rPr>
+              <w:t>Swathi A</w:t>
+            </w:r>
+          </w:p>
+        </w:tc>
+      </w:tr>
+      <w:tr>
+        <w:tc>
+          <w:tcPr>
+            <w:tcW w:type="dxa" w:w="2592"/>
+          </w:tcPr>
+          <w:p>
+            <w:pPr>
+              <w:spacing w:after="100"/>
+              <w:jc w:val="right"/>
+            </w:pPr>
+            <w:r>
+              <w:rPr>
+                <w:b/>
+                <w:color w:val="1A1A2E"/>
+                <w:sz w:val="22"/>
+              </w:rPr>
+              <w:t>Student ID</w:t>
+            </w:r>
+          </w:p>
+        </w:tc>
+        <w:tc>
+          <w:tcPr>
+            <w:tcW w:type="dxa" w:w="5760"/>
+          </w:tcPr>
+          <w:p>
+            <w:pPr>
+              <w:spacing w:after="100"/>
+            </w:pPr>
+            <w:r>
+              <w:rPr>
+                <w:color w:val="333333"/>
+                <w:sz w:val="22"/>
+              </w:rPr>
+              <w:t>2024ADO5447</w:t>
+            </w:r>
+          </w:p>
+        </w:tc>
+      </w:tr>
+      <w:tr>
+        <w:tc>
+          <w:tcPr>
+            <w:tcW w:type="dxa" w:w="2592"/>
+          </w:tcPr>
+          <w:p>
+            <w:pPr>
+              <w:spacing w:after="100"/>
+              <w:jc w:val="right"/>
+            </w:pPr>
+            <w:r>
+              <w:rPr>
+                <w:b/>
+                <w:color w:val="1A1A2E"/>
+                <w:sz w:val="22"/>
+              </w:rPr>
+              <w:t>GitHub</w:t>
+            </w:r>
+          </w:p>
+        </w:tc>
+        <w:tc>
+          <w:tcPr>
+            <w:tcW w:type="dxa" w:w="5760"/>
+          </w:tcPr>
+          <w:p>
+            <w:pPr>
+              <w:spacing w:after="100"/>
+            </w:pPr>
+            <w:r>
+              <w:rPr>
+                <w:color w:val="333333"/>
+                <w:sz w:val="22"/>
+              </w:rPr>
+              <w:t>https://github.com/Swathi-A01/heart-disease-mlops</w:t>
+            </w:r>
+          </w:p>
+        </w:tc>
+      </w:tr>
+      <w:tr>
+        <w:tc>
+          <w:tcPr>
+            <w:tcW w:type="dxa" w:w="2592"/>
+          </w:tcPr>
+          <w:p>
+            <w:pPr>
+              <w:spacing w:after="100"/>
+              <w:jc w:val="right"/>
+            </w:pPr>
+            <w:r>
+              <w:rPr>
+                <w:b/>
+                <w:color w:val="1A1A2E"/>
+                <w:sz w:val="22"/>
+              </w:rPr>
+              <w:t>Dataset</w:t>
+            </w:r>
+          </w:p>
+        </w:tc>
+        <w:tc>
+          <w:tcPr>
+            <w:tcW w:type="dxa" w:w="5760"/>
+          </w:tcPr>
+          <w:p>
+            <w:pPr>
+              <w:spacing w:after="100"/>
+            </w:pPr>
+            <w:r>
+              <w:rPr>
+                <w:color w:val="333333"/>
+                <w:sz w:val="22"/>
+              </w:rPr>
+              <w:t>UCI Heart Disease Dataset (Cleveland)</w:t>
+            </w:r>
+          </w:p>
+        </w:tc>
+      </w:tr>
+    </w:tbl>
+    <w:p/>
+    <w:p>
+      <w:pPr>
+        <w:pBdr>
+          <w:bottom w:val="single" w:sz="4" w:space="1" w:color="C0C0C0"/>
+        </w:pBdr>
+        <w:spacing w:after="320"/>
+      </w:pPr>
     </w:p>
-    <w:p>
-      <w:pPr>
+    <w:tbl>
+      <w:tblPr>
+        <w:tblW w:type="auto" w:w="0"/>
         <w:jc w:val="center"/>
-      </w:pPr>
-      <w:r>
-        <w:rPr>
-          <w:b/>
-          <w:sz w:val="22"/>
-        </w:rPr>
-        <w:t xml:space="preserve">GitHub: </w:t>
-      </w:r>
-      <w:r>
-        <w:rPr>
-          <w:sz w:val="22"/>
-        </w:rPr>
-        <w:t>https://github.com/Swathi-A01/heart-disease-mlops</w:t>
-      </w:r>
-    </w:p>
-    <w:p>
-      <w:pPr>
-        <w:jc w:val="center"/>
-      </w:pPr>
-      <w:r>
-        <w:rPr>
-          <w:b/>
-          <w:sz w:val="22"/>
-        </w:rPr>
-        <w:t xml:space="preserve">Dataset: </w:t>
-      </w:r>
-      <w:r>
-        <w:rPr>
-          <w:sz w:val="22"/>
-        </w:rPr>
-        <w:t>UCI Heart Disease Dataset (Cleveland)</w:t>
-      </w:r>
-    </w:p>
-    <w:p>
-      <w:pPr>
-        <w:jc w:val="center"/>
-      </w:pPr>
-      <w:r>
-        <w:rPr>
-          <w:b/>
-          <w:sz w:val="22"/>
-        </w:rPr>
-        <w:t xml:space="preserve">Total Marks: </w:t>
-      </w:r>
-      <w:r>
-        <w:rPr>
-          <w:sz w:val="22"/>
-        </w:rPr>
-        <w:t>50 / 50</w:t>
-      </w:r>
-    </w:p>
+        <w:tblLook w:firstColumn="1" w:firstRow="1" w:lastColumn="0" w:lastRow="0" w:noHBand="0" w:noVBand="1" w:val="04A0"/>
+      </w:tblPr>
+      <w:tblGrid>
+        <w:gridCol w:w="9066"/>
+      </w:tblGrid>
+      <w:tr>
+        <w:trPr>
+          <w:trHeight w:val="160" w:hRule="exact"/>
+        </w:trPr>
+        <w:tc>
+          <w:tcPr>
+            <w:tcW w:type="dxa" w:w="9066"/>
+            <w:shd w:val="clear" w:color="auto" w:fill="58A6FF"/>
+            <w:tcMar>
+              <w:top w:w="0" w:type="dxa"/>
+              <w:bottom w:w="0" w:type="dxa"/>
+              <w:left w:w="0" w:type="dxa"/>
+              <w:right w:w="0" w:type="dxa"/>
+            </w:tcMar>
+          </w:tcPr>
+          <w:p>
+            <w:r/>
+          </w:p>
+        </w:tc>
+      </w:tr>
+    </w:tbl>
+    <w:p/>
     <w:p>
       <w:r>
         <w:br w:type="page"/>

</xml_diff>